<commit_message>
Agrega al documento de evidencias la sección de acceso y usuarios de prueba
</commit_message>
<xml_diff>
--- a/docs/Evidencias-Edificio-Spring-MVC.docx
+++ b/docs/Evidencias-Edificio-Spring-MVC.docx
@@ -184,6 +184,72 @@
       </w:r>
       <w:r>
         <w:t xml:space="preserve">https://edificios-spring-mvc.onrender.com</w:t>
+      </w:r>
+    </w:p>
+    <w:p>
+      <w:r>
+        <w:br w:type="page"/>
+      </w:r>
+    </w:p>
+    <w:p>
+      <w:pPr>
+        <w:pStyle w:val="Heading1"/>
+        <w:spacing w:after="120" w:before="240"/>
+      </w:pPr>
+      <w:r>
+        <w:t xml:space="preserve">Acceso a la aplicación y usuarios de prueba</w:t>
+      </w:r>
+    </w:p>
+    <w:p>
+      <w:pPr>
+        <w:spacing w:after="120"/>
+      </w:pPr>
+      <w:r>
+        <w:t xml:space="preserve">La aplicación desplegada está en la dirección indicada en la portada. Nota: el servicio gratuito se duerme tras un rato sin uso, por lo que la primera carga puede tardar cerca de 50 segundos.</w:t>
+      </w:r>
+    </w:p>
+    <w:p>
+      <w:pPr>
+        <w:pStyle w:val="ListParagraph"/>
+        <w:numPr>
+          <w:ilvl w:val="0"/>
+          <w:numId w:val="1"/>
+        </w:numPr>
+      </w:pPr>
+      <w:r>
+        <w:t xml:space="preserve">admin@edificios.com · clave Admin123 · rol ADMIN: gestiona edificios y usuarios, y ve todos los reportes.</w:t>
+      </w:r>
+    </w:p>
+    <w:p>
+      <w:pPr>
+        <w:pStyle w:val="ListParagraph"/>
+        <w:numPr>
+          <w:ilvl w:val="0"/>
+          <w:numId w:val="1"/>
+        </w:numPr>
+      </w:pPr>
+      <w:r>
+        <w:t xml:space="preserve">operador@edificios.com · clave Operador123 · rol OPERADOR: gestiona edificios.</w:t>
+      </w:r>
+    </w:p>
+    <w:p>
+      <w:pPr>
+        <w:pStyle w:val="ListParagraph"/>
+        <w:numPr>
+          <w:ilvl w:val="0"/>
+          <w:numId w:val="1"/>
+        </w:numPr>
+      </w:pPr>
+      <w:r>
+        <w:t xml:space="preserve">consulta@edificios.com · clave Consulta123 · rol CONSULTA: solo lectura.</w:t>
+      </w:r>
+    </w:p>
+    <w:p>
+      <w:pPr>
+        <w:spacing w:after="120"/>
+      </w:pPr>
+      <w:r>
+        <w:t xml:space="preserve">El correo es el identificador (id) del usuario. Para probar la recuperación de clave se usa la opción «¿Olvidaste tu clave?» del login con un correo registrado: el sistema envía un enlace con token (vigente 30 minutos y de un solo uso).</w:t>
       </w:r>
     </w:p>
     <w:p>
@@ -1907,7 +1973,7 @@
         <w:spacing w:after="120"/>
       </w:pPr>
       <w:r>
-        <w:t xml:space="preserve">El repositorio tiene 21 commits hechos a medida que se construía el proyecto.</w:t>
+        <w:t xml:space="preserve">El repositorio tiene 24 commits hechos a medida que se construía el proyecto.</w:t>
       </w:r>
     </w:p>
     <w:p>
@@ -2181,6 +2247,45 @@
           <w:szCs w:val="18"/>
         </w:rPr>
         <w:t xml:space="preserve">f044318  2026-09-20  Documenta el despliegue en Render y actualiza documentos de entrega con la URL</w:t>
+      </w:r>
+    </w:p>
+    <w:p>
+      <w:pPr>
+        <w:spacing w:after="60"/>
+      </w:pPr>
+      <w:r>
+        <w:rPr>
+          <w:rFonts w:ascii="Consolas" w:cs="Consolas" w:eastAsia="Consolas" w:hAnsi="Consolas"/>
+          <w:sz w:val="18"/>
+          <w:szCs w:val="18"/>
+        </w:rPr>
+        <w:t xml:space="preserve">5c867e3  2026-09-20  Agrega tabla y entidad de tokens de recuperación con hash SHA-256</w:t>
+      </w:r>
+    </w:p>
+    <w:p>
+      <w:pPr>
+        <w:spacing w:after="60"/>
+      </w:pPr>
+      <w:r>
+        <w:rPr>
+          <w:rFonts w:ascii="Consolas" w:cs="Consolas" w:eastAsia="Consolas" w:hAnsi="Consolas"/>
+          <w:sz w:val="18"/>
+          <w:szCs w:val="18"/>
+        </w:rPr>
+        <w:t xml:space="preserve">bf11d3c  2026-09-20  Recuperación de clave con enlace de token de un solo uso y envío por la API de Brevo, SMTP o log</w:t>
+      </w:r>
+    </w:p>
+    <w:p>
+      <w:pPr>
+        <w:spacing w:after="60"/>
+      </w:pPr>
+      <w:r>
+        <w:rPr>
+          <w:rFonts w:ascii="Consolas" w:cs="Consolas" w:eastAsia="Consolas" w:hAnsi="Consolas"/>
+          <w:sz w:val="18"/>
+          <w:szCs w:val="18"/>
+        </w:rPr>
+        <w:t xml:space="preserve">8000bff  2026-09-20  Actualiza README, guías y documentos para la recuperación por token</w:t>
       </w:r>
     </w:p>
     <w:sectPr>

</xml_diff>